<commit_message>
Fill the ten blanks of the final report v2 and add the Mooncake, threshold and δ paragraphs
The docx was edited directly because content_v2.py lives only on the local WSL2 host; 남은_실험.md
chapter 3 lists every change so the source can be updated and rebuilt. The PDF was re-rendered here
with LibreOffice 6.4 and Noto Sans CJK (Malgun Gothic is not installed), 28 pages.

Co-Authored-By: Claude Opus 5.5 <noreply@anthropic.com>
</commit_message>
<xml_diff>
--- a/docs/report/final_v2/연구논문작품_최종보고서_v2.docx
+++ b/docs/report/final_v2/연구논문작품_최종보고서_v2.docx
@@ -685,7 +685,7 @@
           <w:sz w:val="21"/>
           <w:szCs w:val="21"/>
         </w:rPr>
-        <w:t xml:space="preserve">커널을 교체하지 않고 분할 수만 선택하여, FlashInfer 커널로 교체한 경우(1.83배)에 근접한 개선을 얻었다. 공개 Azure 대화 트레이스를 재생한 분석에서는 디코드 단계의 약 9%(실측 표본 추정)~13.5%(시뮬레이터 예측)가 이러한 취약 조건에 해당함을 확인하였다. 주요 수치는 GPU 없이 원본 기록에서 다시 계산하는 948개 검증 항목으로 확인하였다.</w:t>
+        <w:t xml:space="preserve">커널을 교체하지 않고 분할 수만 선택하여, FlashInfer 커널로 교체한 경우(1.83배)에 근접한 개선을 얻었다. 공개 Azure 대화 트레이스를 재생한 분석에서는 디코드 단계의 약 9%(실측 표본 추정)~13.5%(시뮬레이터 예측)가 이러한 취약 조건에 해당함을 확인하였다. 주요 수치는 GPU 없이 원본 기록에서 다시 계산하는 1,109개 검증 항목으로 확인하였다.</w:t>
       </w:r>
     </w:p>
     <w:p>
@@ -1960,7 +1960,7 @@
                 <w:sz w:val="17"/>
                 <w:szCs w:val="17"/>
               </w:rPr>
-              <w:t xml:space="preserve">검증 948개 항목 통과, 대시보드</w:t>
+              <w:t xml:space="preserve">검증 1,109개 항목 통과, 대시보드</w:t>
             </w:r>
           </w:p>
         </w:tc>
@@ -7084,9 +7084,8 @@
           <w:rFonts w:ascii="맑은 고딕" w:cs="맑은 고딕" w:eastAsia="맑은 고딕" w:hAnsi="맑은 고딕"/>
           <w:sz w:val="21"/>
           <w:szCs w:val="21"/>
-          <w:highlight w:val="yellow"/>
-        </w:rPr>
-        <w:t xml:space="preserve">[      ]</w:t>
+        </w:rPr>
+        <w:t xml:space="preserve">723</w:t>
       </w:r>
       <w:r>
         <w:rPr>
@@ -7728,7 +7727,7 @@
                 <w:sz w:val="17"/>
                 <w:szCs w:val="17"/>
               </w:rPr>
-              <w:t xml:space="preserve">Azure 대화·코드 트레이스, BurstGPT</w:t>
+              <w:t xml:space="preserve">Azure 대화·코드 트레이스, BurstGPT, Mooncake 대화 트레이스</w:t>
             </w:r>
           </w:p>
         </w:tc>
@@ -8395,9 +8394,8 @@
                 <w:bCs w:val="false"/>
                 <w:sz w:val="17"/>
                 <w:szCs w:val="17"/>
-                <w:highlight w:val="yellow"/>
-              </w:rPr>
-              <w:t xml:space="preserve">[      ]</w:t>
+              </w:rPr>
+              <w:t xml:space="preserve">330</w:t>
             </w:r>
             <w:r>
               <w:rPr>
@@ -10461,9 +10459,8 @@
           <w:rFonts w:ascii="맑은 고딕" w:cs="맑은 고딕" w:eastAsia="맑은 고딕" w:hAnsi="맑은 고딕"/>
           <w:sz w:val="21"/>
           <w:szCs w:val="21"/>
-          <w:highlight w:val="yellow"/>
-        </w:rPr>
-        <w:t xml:space="preserve">[      ]</w:t>
+        </w:rPr>
+        <w:t xml:space="preserve">2.7~15.0%(중앙값 6.1%, warm 기준)</w:t>
       </w:r>
       <w:r>
         <w:rPr>
@@ -10697,7 +10694,7 @@
                 <w:sz w:val="17"/>
                 <w:szCs w:val="17"/>
               </w:rPr>
-              <w:t xml:space="preserve">성능 시뮬레이터 µs</w:t>
+              <w:t xml:space="preserve">성능 시뮬레이터 µs*</w:t>
             </w:r>
           </w:p>
         </w:tc>
@@ -10876,9 +10873,8 @@
                 <w:bCs w:val="false"/>
                 <w:sz w:val="17"/>
                 <w:szCs w:val="17"/>
-                <w:highlight w:val="yellow"/>
-              </w:rPr>
-              <w:t xml:space="preserve">[      ]</w:t>
+              </w:rPr>
+              <w:t xml:space="preserve">61.0</w:t>
             </w:r>
           </w:p>
         </w:tc>
@@ -11057,9 +11053,8 @@
                 <w:bCs w:val="false"/>
                 <w:sz w:val="17"/>
                 <w:szCs w:val="17"/>
-                <w:highlight w:val="yellow"/>
-              </w:rPr>
-              <w:t xml:space="preserve">[      ]</w:t>
+              </w:rPr>
+              <w:t xml:space="preserve">460.1</w:t>
             </w:r>
           </w:p>
         </w:tc>
@@ -11238,9 +11233,8 @@
                 <w:bCs w:val="false"/>
                 <w:sz w:val="17"/>
                 <w:szCs w:val="17"/>
-                <w:highlight w:val="yellow"/>
-              </w:rPr>
-              <w:t xml:space="preserve">[      ]</w:t>
+              </w:rPr>
+              <w:t xml:space="preserve">61.0</w:t>
             </w:r>
           </w:p>
         </w:tc>
@@ -11419,9 +11413,8 @@
                 <w:bCs w:val="false"/>
                 <w:sz w:val="17"/>
                 <w:szCs w:val="17"/>
-                <w:highlight w:val="yellow"/>
-              </w:rPr>
-              <w:t xml:space="preserve">[      ]</w:t>
+              </w:rPr>
+              <w:t xml:space="preserve">10.8</w:t>
             </w:r>
           </w:p>
         </w:tc>
@@ -11600,9 +11593,8 @@
                 <w:bCs w:val="false"/>
                 <w:sz w:val="17"/>
                 <w:szCs w:val="17"/>
-                <w:highlight w:val="yellow"/>
-              </w:rPr>
-              <w:t xml:space="preserve">[      ]</w:t>
+              </w:rPr>
+              <w:t xml:space="preserve">23.3</w:t>
             </w:r>
           </w:p>
         </w:tc>
@@ -11781,9 +11773,8 @@
                 <w:bCs w:val="false"/>
                 <w:sz w:val="17"/>
                 <w:szCs w:val="17"/>
-                <w:highlight w:val="yellow"/>
-              </w:rPr>
-              <w:t xml:space="preserve">[      ]</w:t>
+              </w:rPr>
+              <w:t xml:space="preserve">37.2</w:t>
             </w:r>
           </w:p>
         </w:tc>
@@ -11795,6 +11786,27 @@
         <w:spacing w:after="60" w:line="90"/>
         <w:jc w:val="both"/>
       </w:pPr>
+    </w:p>
+    <w:p>
+      <w:pPr>
+        <w:widowControl/>
+        <w:spacing w:after="120" w:before="40" w:line="275"/>
+        <w:jc w:val="both"/>
+        <w:rPr>
+          <w:sz w:val="17"/>
+          <w:szCs w:val="17"/>
+        </w:rPr>
+      </w:pPr>
+      <w:r>
+        <w:rPr>
+          <w:rFonts w:ascii="맑은 고딕" w:cs="맑은 고딕" w:eastAsia="맑은 고딕" w:hAnsi="맑은 고딕"/>
+          <w:b w:val="false"/>
+          <w:bCs w:val="false"/>
+          <w:sz w:val="17"/>
+          <w:szCs w:val="17"/>
+        </w:rPr>
+        <w:t xml:space="preserve">* 실측과 같은 warm 상태의 예측이다. L=8K의 두 조건은 보정에 사용한 측정 격자에 포함되고, L=1K의 네 조건은 보정에 사용하지 않은 조건이다. 성능 시뮬레이터는 같은 GPU의 실측으로 보정하였고 Accel-Sim은 보정하지 않았다.</w:t>
+      </w:r>
     </w:p>
     <w:p>
       <w:pPr>
@@ -13323,6 +13335,40 @@
     </w:p>
     <w:p>
       <w:pPr>
+        <w:widowControl/>
+        <w:spacing w:after="110" w:line="330"/>
+        <w:jc w:val="both"/>
+      </w:pPr>
+      <w:r>
+        <w:rPr>
+          <w:rFonts w:ascii="맑은 고딕" w:cs="맑은 고딕" w:eastAsia="맑은 고딕" w:hAnsi="맑은 고딕"/>
+          <w:b w:val="false"/>
+          <w:bCs w:val="false"/>
+          <w:sz w:val="21"/>
+          <w:szCs w:val="21"/>
+        </w:rPr>
+        <w:t xml:space="preserve">긴 문맥 서비스의 길이 분포에서는 이러한 조건이 더 자주 나타날 수 있다. Mooncake[20]가 공개한 대화 서비스 트레이스는 요청 12,031개의 입력 길이 중앙값이 6,909토큰이고 6.9%가 32K 토큰 이상이다. 같은 방식으로 재생하면 RTX 4090의 KV 예산(10 GiB)에서는 긴 요청 몇 개가 KV 캐시를 채워 평균 배치가 5.0에 머물렀고, 손실이 1.25배 이상인 디코드 단계는 9.3%였다. KV 예산을 436K 토큰으로 둔 what-if에서는 대기가 거의 없는 부하(도착률 0.5배, 평균 배치 17.4)에서도 17.0%, 원래 도착률(KV 포화, 평균 배치 30.8)에서는 61.3%로 예측되었다. 이 값은 시뮬레이터 예측이며, 토큰 수는 Kimi 토크나이저 기준이고 64K를 넘는 길이는 측정 범위 밖의 외삽이다.</w:t>
+      </w:r>
+    </w:p>
+    <w:p>
+      <w:pPr>
+        <w:widowControl/>
+        <w:spacing w:after="110" w:line="330"/>
+        <w:jc w:val="both"/>
+      </w:pPr>
+      <w:r>
+        <w:rPr>
+          <w:rFonts w:ascii="맑은 고딕" w:cs="맑은 고딕" w:eastAsia="맑은 고딕" w:hAnsi="맑은 고딕"/>
+          <w:b w:val="false"/>
+          <w:bCs w:val="false"/>
+          <w:sz w:val="21"/>
+          <w:szCs w:val="21"/>
+        </w:rPr>
+        <w:t xml:space="preserve">배치 크기 26이라는 경계는 RTX 4090(SM 128개)과 KV 헤드 8개의 조합에서 정해진 값이다. FlashAttention 2.8.3의 규칙(B×H_kv ≥ 0.8×2×SM 수)으로 계산하면, KV 헤드가 8개인 모델을 GPU 한 장에서 실행할 때 분할 없이 실행되기 시작하는 배치 크기는 L4 12, A100 22, H100 SXM5 27, L40 29 등 조사한 8종 GPU에서 12~29였다. 텐서 병렬로 GPU당 KV 헤드가 2개로 줄면 이 값은 47~114로 커진다. 실측이 아니라 라이브러리 규칙을 계산한 값이지만, RTX 4090에서 기록한 두 헤드 구성의 휴리스틱 실행 785건에서 분할 여부가 모두 이 규칙과 일치하였다. 즉 이 취약 조건은 특정 GPU에 국한되지 않으며, SM 수가 적은 GPU일수록 더 작은 배치에서 나타난다.</w:t>
+      </w:r>
+    </w:p>
+    <w:p>
+      <w:pPr>
         <w:pStyle w:val="Heading2"/>
         <w:keepNext/>
         <w:spacing w:after="120" w:before="260" w:line="330"/>
@@ -15142,6 +15188,23 @@
           <w:sz w:val="21"/>
           <w:szCs w:val="21"/>
         </w:rPr>
+        <w:t xml:space="preserve">δ의 선택이 결과를 좌우하는지 확인하기 위해 δ를 0에서 1까지 0.01 간격으로 바꾸어 같은 평가를 반복하였다. 세 집합의 최악 손실이 모두 15% 이내인 구간은 δ=0.16~0.32였고, 0.16~0.26에서는 최악 손실이 표 13의 값과 같았다. δ가 이보다 작으면 성능 모델의 순위 오류가, 크면 테이블의 선택 오류가 다시 나타났다. 즉 δ=0.2는 기준을 만족하는 평탄한 구간 안의 값이다.</w:t>
+      </w:r>
+    </w:p>
+    <w:p>
+      <w:pPr>
+        <w:widowControl/>
+        <w:spacing w:after="110" w:line="330"/>
+        <w:jc w:val="both"/>
+      </w:pPr>
+      <w:r>
+        <w:rPr>
+          <w:rFonts w:ascii="맑은 고딕" w:cs="맑은 고딕" w:eastAsia="맑은 고딕" w:hAnsi="맑은 고딕"/>
+          <w:b w:val="false"/>
+          <w:bCs w:val="false"/>
+          <w:sz w:val="21"/>
+          <w:szCs w:val="21"/>
+        </w:rPr>
         <w:t xml:space="preserve">실제 생성에서도 혼합 정책을 검증하였다. 테이블의 측정 범위에 없는 요청 도착 조건에서 혼합 정책은 일부 단계에서 시뮬레이터의 순위를 따라 테이블보다 빠른 커널을 골라, 단계당 attention 시간을 3.31 ms에서 3.00 ms로 줄였다. 결정 캐시를 유지하는 조건에서 TPOT 개선은 혼합 정책 1.090배, 성능 모델 정책 1.091배로 테이블 정책(1.086배)보다 높았다. 판단 비용을 줄인 성능 시뮬레이터가 측정하지 않은 조건에서 실측 테이블을 보완할 수 있음을 보여 준다.</w:t>
       </w:r>
     </w:p>
@@ -17665,7 +17728,7 @@
           <w:sz w:val="21"/>
           <w:szCs w:val="21"/>
         </w:rPr>
-        <w:t xml:space="preserve">표 12의 네 시나리오에서 테이블 정책은 모든 반복에서 기본 설정과 같은 토큰을 생성하였다. 출력 보존을 정답 수준에서도 확인하기 위해 GSM8K[20] 200문항을 긴 문맥 요청과 함께 혼합 길이 배치로 실행하였다. 테이블 정책과 고정 8은 200문항 모두 기본 설정과 같은 답을 생성하였으며 정답률도 같았다. 반면 FlashInfer CUDA-core 변형은 140문항에서 생성 결과가 달라졌고 8문항의 최종 답이 바뀌었다. 같은 커널 안에서 분할 수만 바꾸는 방식이 커널을 교체하는 방식보다 출력을 보존하기 쉽다는 것을 보여 준다.</w:t>
+        <w:t xml:space="preserve">표 12의 네 시나리오에서 테이블 정책은 모든 반복에서 기본 설정과 같은 토큰을 생성하였다. 출력 보존을 정답 수준에서도 확인하기 위해 GSM8K[21] 200문항을 긴 문맥 요청과 함께 혼합 길이 배치로 실행하였다. 테이블 정책과 고정 8은 200문항 모두 기본 설정과 같은 답을 생성하였으며 정답률도 같았다. 반면 FlashInfer CUDA-core 변형은 140문항에서 생성 결과가 달라졌고 8문항의 최종 답이 바뀌었다. 같은 커널 안에서 분할 수만 바꾸는 방식이 커널을 교체하는 방식보다 출력을 보존하기 쉽다는 것을 보여 준다.</w:t>
       </w:r>
     </w:p>
     <w:p>
@@ -17699,16 +17762,15 @@
           <w:sz w:val="21"/>
           <w:szCs w:val="21"/>
         </w:rPr>
-        <w:t xml:space="preserve">GPU가 없는 노트북 환경에서 kernelscope verify로 커널 측정, 시뮬레이터, 실제 모델 실행, 트레이스 분석의 원본 기록에서 948개 수치를 다시 계산했으며 모두 일치하였다. 검증에는 약 </w:t>
+        <w:t xml:space="preserve">GPU 없이 kernelscope verify로 커널 측정, 시뮬레이터, 실제 모델 실행, 트레이스 분석의 원본 기록에서 1,109개 수치를 다시 계산했으며 모두 일치하였다. 검증에는 약 </w:t>
       </w:r>
       <w:r>
         <w:rPr>
           <w:rFonts w:ascii="맑은 고딕" w:cs="맑은 고딕" w:eastAsia="맑은 고딕" w:hAnsi="맑은 고딕"/>
           <w:sz w:val="21"/>
           <w:szCs w:val="21"/>
-          <w:highlight w:val="yellow"/>
-        </w:rPr>
-        <w:t xml:space="preserve">[      ]</w:t>
+        </w:rPr>
+        <w:t xml:space="preserve">31</w:t>
       </w:r>
       <w:r>
         <w:rPr>
@@ -19358,7 +19420,29 @@
           <w:sz w:val="19"/>
           <w:szCs w:val="19"/>
         </w:rPr>
-        <w:t xml:space="preserve">[20] K. Cobbe et al., “Training verifiers to solve math word problems,” arXiv:2110.14168, 2021.</w:t>
+        <w:t xml:space="preserve">[20] R. Qin et al., “Mooncake: Trading more storage for less computation — A KVCache-centric architecture for serving LLM chatbot,” USENIX FAST, 2025.</w:t>
+      </w:r>
+    </w:p>
+    <w:p>
+      <w:pPr>
+        <w:widowControl/>
+        <w:spacing w:after="110" w:line="290"/>
+        <w:ind w:left="450" w:hanging="450"/>
+        <w:jc w:val="left"/>
+        <w:rPr>
+          <w:sz w:val="19"/>
+          <w:szCs w:val="19"/>
+        </w:rPr>
+      </w:pPr>
+      <w:r>
+        <w:rPr>
+          <w:rFonts w:ascii="맑은 고딕" w:cs="맑은 고딕" w:eastAsia="맑은 고딕" w:hAnsi="맑은 고딕"/>
+          <w:b w:val="false"/>
+          <w:bCs w:val="false"/>
+          <w:sz w:val="19"/>
+          <w:szCs w:val="19"/>
+        </w:rPr>
+        <w:t xml:space="preserve">[21] K. Cobbe et al., “Training verifiers to solve math word problems,” arXiv:2110.14168, 2021.</w:t>
       </w:r>
     </w:p>
     <w:p>

</xml_diff>

<commit_message>
Reflect the GPU optional experiments in the final report v2 and the progress notes
Table 14 footnote gains the re-measured 1.823x; 4장 바) states that the trace e2e divergences are all bf16
ties; the vLLM paragraph states that FA2 decode ran with num_splits=1 in eager and CUDA graph mode; table 17
and the limitation paragraph follow. Unit tests 725, verify 1,181 items in about 32 s. The edits to carry
into content_v2.py are listed in 남은_실험.md 3.2.

Co-Authored-By: Claude Opus 5.5 <noreply@anthropic.com>
</commit_message>
<xml_diff>
--- a/docs/report/final_v2/연구논문작품_최종보고서_v2.docx
+++ b/docs/report/final_v2/연구논문작품_최종보고서_v2.docx
@@ -685,7 +685,7 @@
           <w:sz w:val="21"/>
           <w:szCs w:val="21"/>
         </w:rPr>
-        <w:t xml:space="preserve">커널을 교체하지 않고 분할 수만 선택하여, FlashInfer 커널로 교체한 경우(1.83배)에 근접한 개선을 얻었다. 공개 Azure 대화 트레이스를 재생한 분석에서는 디코드 단계의 약 9%(실측 표본 추정)~13.5%(시뮬레이터 예측)가 이러한 취약 조건에 해당함을 확인하였다. 주요 수치는 GPU 없이 원본 기록에서 다시 계산하는 1,109개 검증 항목으로 확인하였다.</w:t>
+        <w:t xml:space="preserve">커널을 교체하지 않고 분할 수만 선택하여, FlashInfer 커널로 교체한 경우(1.83배)에 근접한 개선을 얻었다. 공개 Azure 대화 트레이스를 재생한 분석에서는 디코드 단계의 약 9%(실측 표본 추정)~13.5%(시뮬레이터 예측)가 이러한 취약 조건에 해당함을 확인하였다. 주요 수치는 GPU 없이 원본 기록에서 다시 계산하는 1,181개 검증 항목으로 확인하였다.</w:t>
       </w:r>
     </w:p>
     <w:p>
@@ -1960,7 +1960,7 @@
                 <w:sz w:val="17"/>
                 <w:szCs w:val="17"/>
               </w:rPr>
-              <w:t xml:space="preserve">검증 1,109개 항목 통과, 대시보드</w:t>
+              <w:t xml:space="preserve">검증 1,181개 항목 통과, 대시보드</w:t>
             </w:r>
           </w:p>
         </w:tc>
@@ -7085,7 +7085,7 @@
           <w:sz w:val="21"/>
           <w:szCs w:val="21"/>
         </w:rPr>
-        <w:t xml:space="preserve">723</w:t>
+        <w:t xml:space="preserve">725</w:t>
       </w:r>
       <w:r>
         <w:rPr>
@@ -16054,7 +16054,7 @@
           <w:sz w:val="17"/>
           <w:szCs w:val="17"/>
         </w:rPr>
-        <w:t xml:space="preserve">* 3회 반복 중 원인을 확인하지 못한 느린 반복 1회를 포함한 값이며, 이를 제외하면 1.811배이다.</w:t>
+        <w:t xml:space="preserve">* 3회 반복 중 원인을 확인하지 못한 느린 반복 1회를 포함한 값이며, 이를 제외하면 1.811배이다. 같은 규약으로 다시 측정한 값은 1.823배였고 느린 반복은 다시 나타나지 않았다(같은 재측정에서 테이블 1.806배, 고정 16 1.814배).</w:t>
       </w:r>
     </w:p>
     <w:p>
@@ -17660,7 +17660,7 @@
           <w:sz w:val="21"/>
           <w:szCs w:val="21"/>
         </w:rPr>
-        <w:t xml:space="preserve">이 결과는 혼합 길이 배치의 attention 병목이 직접 구현한 실험 엔진만의 현상이 아니라, 널리 사용되는 서빙 엔진에서도 디코드 시간의 대부분을 차지함을 보여 준다.</w:t>
+        <w:t xml:space="preserve">프로파일의 커널 기록을 보면 FLASH_ATTN 백엔드의 디코드 attention은 eager 실행과 CUDA graph 실행(커널 호출을 미리 기록해 재생하는 방식) 모두에서 분할 없이(num_splits=1) 실행되었다. 배치 크기 32가 RTX 4090에서 분할 없이 실행되는 경계(26) 이상이기 때문이며, 3장에서 다룬 분할 수 휴리스틱의 판단과 같다. 이 결과는 혼합 길이 배치의 attention 병목이 직접 구현한 실험 엔진만의 현상이 아니라, 널리 사용되는 서빙 엔진에서도 디코드 시간의 대부분을 차지함을 보여 준다.</w:t>
       </w:r>
     </w:p>
     <w:p>
@@ -17745,7 +17745,7 @@
           <w:sz w:val="21"/>
           <w:szCs w:val="21"/>
         </w:rPr>
-        <w:t xml:space="preserve">출력이 달라진 조건은 3장 마)의 검증 과정으로 분석하였다. 균일 길이에서 고정 8이 만든 6개의 분기 위치 중 5개는 상위 두 로짓의 차이가 bf16 표현 간격 1개 이내인 동점이었다. 나머지 1개도 같은 KV 상태의 커널 탐침에서 36개 층 모두 분할 1과 bf16 간격 1개 이내로 일치하고 최대 확률 토큰이 유지되어, 구현 오류가 아니라 실행 중 누적된 반올림 차이가 증폭된 것으로 확인하였다.</w:t>
+        <w:t xml:space="preserve">출력이 달라진 조건은 3장 마)의 검증 과정으로 분석하였다. 균일 길이에서 고정 8이 만든 6개의 분기 위치 중 5개는 상위 두 로짓의 차이가 bf16 표현 간격 1개 이내인 동점이었다. 나머지 1개도 같은 KV 상태의 커널 탐침에서 36개 층 모두 분할 1과 bf16 간격 1개 이내로 일치하고 최대 확률 토큰이 유지되어, 구현 오류가 아니라 실행 중 누적된 반올림 차이가 증폭된 것으로 확인하였다. 공개 트레이스 구간의 실제 생성에서 세 정책이 만든 분기 위치(테이블과 혼합 정책 각 10곳, 성능 모델 8곳)도 teacher forcing 실행으로 모두 분석하였으며, 모두 상위 두 로짓의 차이가 bf16 표현 간격 2개 이내인 동점이었다.</w:t>
       </w:r>
     </w:p>
     <w:p>
@@ -17762,7 +17762,7 @@
           <w:sz w:val="21"/>
           <w:szCs w:val="21"/>
         </w:rPr>
-        <w:t xml:space="preserve">GPU 없이 kernelscope verify로 커널 측정, 시뮬레이터, 실제 모델 실행, 트레이스 분석의 원본 기록에서 1,109개 수치를 다시 계산했으며 모두 일치하였다. 검증에는 약 </w:t>
+        <w:t xml:space="preserve">GPU 없이 kernelscope verify로 커널 측정, 시뮬레이터, 실제 모델 실행, 트레이스 분석의 원본 기록에서 1,181개 수치를 다시 계산했으며 모두 일치하였다. 검증에는 약 </w:t>
       </w:r>
       <w:r>
         <w:rPr>
@@ -17770,7 +17770,7 @@
           <w:sz w:val="21"/>
           <w:szCs w:val="21"/>
         </w:rPr>
-        <w:t xml:space="preserve">31</w:t>
+        <w:t xml:space="preserve">32</w:t>
       </w:r>
       <w:r>
         <w:rPr>
@@ -18149,7 +18149,7 @@
                 <w:sz w:val="17"/>
                 <w:szCs w:val="17"/>
               </w:rPr>
-              <w:t xml:space="preserve">64K 무작위 토큰 입력, 트레이스 구간에서 일부 분기</w:t>
+              <w:t xml:space="preserve">64K 무작위 토큰 입력에서 분기 1곳(트레이스 구간의 분기는 모두 동점)</w:t>
             </w:r>
           </w:p>
         </w:tc>
@@ -18761,7 +18761,7 @@
           <w:sz w:val="21"/>
           <w:szCs w:val="21"/>
         </w:rPr>
-        <w:t xml:space="preserve">특히 트레이스 구간 실행에서는 결정 캐시가 비어 있는 첫 반복에서 성능 모델과 혼합 정책이 단계당 약 6.5 ms의 판단 비용으로 느려졌고, 세 정책 모두 일부 요청에서 출력이 기본 설정과 달라졌다. warm 상태에서는 혼합 정책의 최악 선택 손실도 41.7%로 기준을 넘었다. 선택 비용과 수치 차이를 함께 관리하는 정책이 다음 단계의 과제이다.</w:t>
+        <w:t xml:space="preserve">특히 트레이스 구간 실행에서는 결정 캐시가 비어 있는 첫 반복에서 성능 모델과 혼합 정책이 단계당 약 6.5 ms의 판단 비용으로 느려졌고, 세 정책 모두 일부 요청에서 출력이 기본 설정과 달라졌다(분기 위치는 모두 bf16 동점). warm 상태에서는 혼합 정책의 최악 선택 손실도 41.7%로 기준을 넘었다. 선택 비용과 수치 차이를 함께 관리하는 정책이 다음 단계의 과제이다.</w:t>
       </w:r>
     </w:p>
     <w:p>

</xml_diff>